<commit_message>
Restore original redesigned screens with live service adapters
</commit_message>
<xml_diff>
--- a/docs/Integration_and_Setup_Guide.docx
+++ b/docs/Integration_and_Setup_Guide.docx
@@ -24,18 +24,18 @@
         <w:rPr>
           <w:b/>
         </w:rPr>
-        <w:t>Review candidate published on Feature/Integration</w:t>
+        <w:t>Local frontend restoration on Feature/Integration</w:t>
       </w:r>
       <w:r/>
     </w:p>
     <w:p>
       <w:r>
-        <w:t>20 September 2026  |  Code baseline 2d4ac57</w:t>
+        <w:t>20 September 2026  |  Restoration based on 61604e1 and original design 92ff6d1</w:t>
       </w:r>
     </w:p>
     <w:p>
       <w:r>
-        <w:t>This handoff combines the integration report and setup guide for teammates reviewing or running the project. The redesigned frontend and active backend modules are connected. Full stability is not yet established: successful actual-model processing and external-source acceptance remain outstanding.</w:t>
+        <w:t>This handoff combines the integration report and setup guide for teammates reviewing or running the project. The original frontend layouts are restored and connected to the existing services. These restoration changes remain local for visual review. Full system stability is not yet established: successful actual-model processing and external-source acceptance remain outstanding.</w:t>
       </w:r>
     </w:p>
     <w:p>
@@ -48,7 +48,7 @@
     </w:p>
     <w:p>
       <w:r>
-        <w:t>117 automated tests passed across the frontend, gateway and Audit, Ingestion, AI, Search, and Download. Local five-modality workflows passed with controlled AI outputs, and actual AI and Search CLIP embeddings matched. Eleven optional native codec tests were skipped. Broad lint is not clean, and no frontend type-check suite is configured.</w:t>
+        <w:t>Restoration verification passed the frontend build, 12 service and adapter tests, 11 live browser workflow groups, and nine deterministic UI checks. There are 110 desktop and mobile comparison captures with no page errors or horizontal overflow. Earlier backend and five-modality results are recorded separately and were not rerun for this UI phase. Full AI processing remains blocked by missing model resources.</w:t>
       </w:r>
     </w:p>
     <w:p>
@@ -61,7 +61,7 @@
     </w:p>
     <w:p>
       <w:r>
-        <w:t>Supply the RAM++ checkpoint and remaining model resources; complete real S3 and remote NAS workflows; rehearse migrations on a disposable deployment copy; and finish broader lint and browser coverage. Supplied S3 access passed a bounded listing only. The supplied RDS connection timed out before authentication.</w:t>
+        <w:t>Supply the RAM++ checkpoint and remaining model resources; complete real S3 and remote NAS workflows; rehearse migrations on a disposable deployment copy; and finish broader lint and remaining administration edge-case coverage. Supplied S3 access passed a bounded listing only. The supplied RDS connection timed out before authentication.</w:t>
       </w:r>
     </w:p>
     <w:p>
@@ -122,6 +122,50 @@
       </w:r>
       <w:r>
         <w:t xml:space="preserve"> after the user explicitly authorized the push. This is a review candidate. No pull request, main-branch update, history rewrite, production deployment, or enterprise identity rollout was performed.</w:t>
+      </w:r>
+    </w:p>
+    <w:p>
+      <w:r>
+        <w:t xml:space="preserve">The subsequent frontend restoration is </w:t>
+      </w:r>
+      <w:r>
+        <w:rPr>
+          <w:b/>
+        </w:rPr>
+        <w:t>local only on Feature/Integration</w:t>
+      </w:r>
+      <w:r>
+        <w:t xml:space="preserve">, based on the original design at </w:t>
+      </w:r>
+      <w:r>
+        <w:rPr>
+          <w:rFonts w:ascii="Courier New" w:hAnsi="Courier New"/>
+          <w:sz w:val="18"/>
+        </w:rPr>
+        <w:t>92ff6d1</w:t>
+      </w:r>
+      <w:r>
+        <w:t xml:space="preserve">. The remote integration reference remains </w:t>
+      </w:r>
+      <w:r>
+        <w:rPr>
+          <w:rFonts w:ascii="Courier New" w:hAnsi="Courier New"/>
+          <w:sz w:val="18"/>
+        </w:rPr>
+        <w:t>61604e1</w:t>
+      </w:r>
+      <w:r>
+        <w:t xml:space="preserve"> (the earlier code and handoff). The original redesign branch and </w:t>
+      </w:r>
+      <w:r>
+        <w:rPr>
+          <w:rFonts w:ascii="Courier New" w:hAnsi="Courier New"/>
+          <w:sz w:val="18"/>
+        </w:rPr>
+        <w:t>main</w:t>
+      </w:r>
+      <w:r>
+        <w:t xml:space="preserve"> were not changed. See the restoration validation below; historical backend results are not represented as newly rerun tests.</w:t>
       </w:r>
     </w:p>
     <w:p>
@@ -2281,12 +2325,769 @@
         <w:pStyle w:val="Heading2"/>
       </w:pPr>
       <w:r>
-        <w:t>Reproduction and remaining acceptance work</w:t>
+        <w:t>Frontend restoration and visual review</w:t>
       </w:r>
     </w:p>
     <w:p>
       <w:r>
-        <w:t xml:space="preserve">Use deploy/integration/README.md for environment mappings, build/start commands, schemas/migration order, source mounts, model checkpoints, ffmpeg/ffprobe, optional codecs, readiness, and recovery. The current local UI is at </w:t>
+        <w:t xml:space="preserve">The initial integration retained the shared design shell but simplified several module screens. This restoration corrects that: the original Overview, Sources, Ingestion, Enrichment, Audit, administrator Search, user Search, Downloads, connector forms, file inspector, similarity panel, and floating selection/download bar were restored from </w:t>
+      </w:r>
+      <w:r>
+        <w:rPr>
+          <w:rFonts w:ascii="Courier New" w:hAnsi="Courier New"/>
+          <w:sz w:val="18"/>
+        </w:rPr>
+        <w:t>92ff6d1</w:t>
+      </w:r>
+      <w:r>
+        <w:t>, then adapted to the existing authenticated services. Public/login/registration screens were compared as well. The original React motion primitives, fonts, styles, icons, responsive layouts, navigation, cards, and tables remain active. No backend code, public API, database migration, credential file, or volume was changed during restoration.</w:t>
+      </w:r>
+    </w:p>
+    <w:p>
+      <w:r>
+        <w:t>Frontend adapters map canonical document IDs and actual service responses into these components. Administrator and user search retain their separate layouts while sharing requests, server ordering, hybrid/text/vector modes, filters, pagination, autocomplete cancellation, and protected previews. Connector creation/test/manual scan/archive and persisted AI retry remain real operations. Two leftover prototype success handlers were found and removed: manual crawl now calls the service; independent checksum revalidation is visibly disabled. Visual review also found and removed integration CSS overrides that shrank the welcome heading and changed table spacing. A browser regression caught Escape clearing the search field while dismissing suggestions; that is fixed.</w:t>
+      </w:r>
+    </w:p>
+    <w:p>
+      <w:pPr>
+        <w:pStyle w:val="Heading3"/>
+      </w:pPr>
+      <w:r>
+        <w:t>Intentional visual and wording differences</w:t>
+      </w:r>
+    </w:p>
+    <w:p>
+      <w:pPr>
+        <w:pStyle w:val="ListBullet"/>
+      </w:pPr>
+      <w:r>
+        <w:t>Unsupported metrics remain in their original cards as unavailable: aggregate storage, global modality totals, recent chronological discoveries, live ingest speed, daily validation totals, model throughput/latency/queues, vector arrays, and aggregate confidence. They are not replaced with fixture values. Counts and status from supported endpoints are real.</w:t>
+      </w:r>
+    </w:p>
+    <w:p>
+      <w:pPr>
+        <w:pStyle w:val="ListBullet"/>
+      </w:pPr>
+      <w:r>
+        <w:t>Scheduling tiles, standalone checksum validation, model benchmarking, alternate relevance sorting/confidence filtering, and Audit date filters remain visible but disabled with explanations. Source creation is followed by a real persisted connection test. Public administrator registration is disabled; administrator accounts require an existing administrator.</w:t>
+      </w:r>
+    </w:p>
+    <w:p>
+      <w:pPr>
+        <w:pStyle w:val="ListBullet"/>
+      </w:pPr>
+      <w:r>
+        <w:t>Manual scans replace continuous/scheduled ingestion wording. Configured vectors are 512-dimensional. Relevance scores are not displayed as confidence percentages. AI stages are grouped into four original cards using persisted stage outcomes; indexing is described separately.</w:t>
+      </w:r>
+    </w:p>
+    <w:p>
+      <w:pPr>
+        <w:pStyle w:val="ListBullet"/>
+      </w:pPr>
+      <w:r>
+        <w:t>Protected image/audio/video content replaces prototype media and bounding-box graphics. Unsupported document/tabular previews and missing source-location fields are explicitly unavailable; original inspector sections remain. Preview size is capped at 32 MiB. Bookmarks are explicitly local to the account in this browser.</w:t>
+      </w:r>
+    </w:p>
+    <w:p>
+      <w:pPr>
+        <w:pStyle w:val="ListBullet"/>
+      </w:pPr>
+      <w:r>
+        <w:t>Added controls needed by the integration use the existing style: backend pagination and additional filters, administrator Downloads navigation, connector archive/delete-if-unused, task selection/retry and metadata inspection, and persistent archive retrieval. These are intentional additions, not pixel-identical prototype behavior.</w:t>
+      </w:r>
+    </w:p>
+    <w:p>
+      <w:pPr>
+        <w:pStyle w:val="Heading3"/>
+      </w:pPr>
+      <w:r>
+        <w:t>Restoration verification</w:t>
+      </w:r>
+    </w:p>
+    <w:tbl>
+      <w:tblPr>
+        <w:tblW w:type="auto" w:w="0"/>
+        <w:jc w:val="center"/>
+        <w:tblLayout w:type="fixed"/>
+        <w:tblLook w:firstColumn="1" w:firstRow="1" w:lastColumn="0" w:lastRow="0" w:noHBand="0" w:noVBand="1" w:val="04A0"/>
+      </w:tblPr>
+      <w:tblGrid>
+        <w:gridCol w:w="4464"/>
+        <w:gridCol w:w="5616"/>
+      </w:tblGrid>
+      <w:tr>
+        <w:trPr>
+          <w:cantSplit/>
+          <w:tblHeader/>
+        </w:trPr>
+        <w:tc>
+          <w:tcPr>
+            <w:tcW w:type="dxa" w:w="4464"/>
+            <w:vAlign w:val="center"/>
+            <w:shd w:fill="DBE5EC"/>
+            <w:tcBorders>
+              <w:top w:val="single" w:sz="4" w:color="D9D9D9"/>
+              <w:left w:val="single" w:sz="4" w:color="D9D9D9"/>
+              <w:bottom w:val="single" w:sz="4" w:color="D9D9D9"/>
+              <w:right w:val="single" w:sz="4" w:color="D9D9D9"/>
+            </w:tcBorders>
+            <w:tcMar>
+              <w:top w:w="95" w:type="dxa"/>
+              <w:left w:w="95" w:type="dxa"/>
+              <w:bottom w:w="95" w:type="dxa"/>
+              <w:right w:w="95" w:type="dxa"/>
+            </w:tcMar>
+          </w:tcPr>
+          <w:p>
+            <w:pPr>
+              <w:spacing w:after="100" w:before="100" w:line="247" w:lineRule="auto"/>
+            </w:pPr>
+            <w:r>
+              <w:rPr>
+                <w:b/>
+                <w:sz w:val="20"/>
+              </w:rPr>
+              <w:t>Check</w:t>
+            </w:r>
+          </w:p>
+        </w:tc>
+        <w:tc>
+          <w:tcPr>
+            <w:tcW w:type="dxa" w:w="5616"/>
+            <w:vAlign w:val="center"/>
+            <w:shd w:fill="DBE5EC"/>
+            <w:tcBorders>
+              <w:top w:val="single" w:sz="4" w:color="D9D9D9"/>
+              <w:left w:val="single" w:sz="4" w:color="D9D9D9"/>
+              <w:bottom w:val="single" w:sz="4" w:color="D9D9D9"/>
+              <w:right w:val="single" w:sz="4" w:color="D9D9D9"/>
+            </w:tcBorders>
+            <w:tcMar>
+              <w:top w:w="95" w:type="dxa"/>
+              <w:left w:w="95" w:type="dxa"/>
+              <w:bottom w:w="95" w:type="dxa"/>
+              <w:right w:w="95" w:type="dxa"/>
+            </w:tcMar>
+          </w:tcPr>
+          <w:p>
+            <w:pPr>
+              <w:spacing w:after="100" w:before="100" w:line="247" w:lineRule="auto"/>
+            </w:pPr>
+            <w:r>
+              <w:rPr>
+                <w:b/>
+                <w:sz w:val="20"/>
+              </w:rPr>
+              <w:t>Result</w:t>
+            </w:r>
+          </w:p>
+        </w:tc>
+      </w:tr>
+      <w:tr>
+        <w:trPr>
+          <w:cantSplit/>
+        </w:trPr>
+        <w:tc>
+          <w:tcPr>
+            <w:tcW w:type="dxa" w:w="4464"/>
+            <w:vAlign w:val="center"/>
+            <w:shd w:fill="FFFFFF"/>
+            <w:tcBorders>
+              <w:top w:val="single" w:sz="4" w:color="D9D9D9"/>
+              <w:left w:val="single" w:sz="4" w:color="D9D9D9"/>
+              <w:bottom w:val="single" w:sz="4" w:color="D9D9D9"/>
+              <w:right w:val="single" w:sz="4" w:color="D9D9D9"/>
+            </w:tcBorders>
+            <w:tcMar>
+              <w:top w:w="95" w:type="dxa"/>
+              <w:left w:w="95" w:type="dxa"/>
+              <w:bottom w:w="95" w:type="dxa"/>
+              <w:right w:w="95" w:type="dxa"/>
+            </w:tcMar>
+          </w:tcPr>
+          <w:p>
+            <w:pPr>
+              <w:spacing w:after="100" w:before="100" w:line="247" w:lineRule="auto"/>
+            </w:pPr>
+            <w:r>
+              <w:rPr>
+                <w:sz w:val="20"/>
+              </w:rPr>
+            </w:r>
+            <w:r>
+              <w:rPr>
+                <w:rFonts w:ascii="Courier New" w:hAnsi="Courier New"/>
+                <w:sz w:val="20"/>
+              </w:rPr>
+              <w:t>cd frontend; npm test</w:t>
+            </w:r>
+            <w:r>
+              <w:rPr>
+                <w:sz w:val="20"/>
+              </w:rPr>
+            </w:r>
+          </w:p>
+        </w:tc>
+        <w:tc>
+          <w:tcPr>
+            <w:tcW w:type="dxa" w:w="5616"/>
+            <w:vAlign w:val="center"/>
+            <w:shd w:fill="FFFFFF"/>
+            <w:tcBorders>
+              <w:top w:val="single" w:sz="4" w:color="D9D9D9"/>
+              <w:left w:val="single" w:sz="4" w:color="D9D9D9"/>
+              <w:bottom w:val="single" w:sz="4" w:color="D9D9D9"/>
+              <w:right w:val="single" w:sz="4" w:color="D9D9D9"/>
+            </w:tcBorders>
+            <w:tcMar>
+              <w:top w:w="95" w:type="dxa"/>
+              <w:left w:w="95" w:type="dxa"/>
+              <w:bottom w:w="95" w:type="dxa"/>
+              <w:right w:w="95" w:type="dxa"/>
+            </w:tcMar>
+          </w:tcPr>
+          <w:p>
+            <w:pPr>
+              <w:spacing w:after="100" w:before="100" w:line="247" w:lineRule="auto"/>
+            </w:pPr>
+            <w:r>
+              <w:rPr>
+                <w:sz w:val="20"/>
+              </w:rPr>
+              <w:t>12 passed: six existing HTTP contracts and six new adapter/permission/error regressions</w:t>
+            </w:r>
+          </w:p>
+        </w:tc>
+      </w:tr>
+      <w:tr>
+        <w:trPr>
+          <w:cantSplit/>
+        </w:trPr>
+        <w:tc>
+          <w:tcPr>
+            <w:tcW w:type="dxa" w:w="4464"/>
+            <w:vAlign w:val="center"/>
+            <w:shd w:fill="FFFFFF"/>
+            <w:tcBorders>
+              <w:top w:val="single" w:sz="4" w:color="D9D9D9"/>
+              <w:left w:val="single" w:sz="4" w:color="D9D9D9"/>
+              <w:bottom w:val="single" w:sz="4" w:color="D9D9D9"/>
+              <w:right w:val="single" w:sz="4" w:color="D9D9D9"/>
+            </w:tcBorders>
+            <w:tcMar>
+              <w:top w:w="95" w:type="dxa"/>
+              <w:left w:w="95" w:type="dxa"/>
+              <w:bottom w:w="95" w:type="dxa"/>
+              <w:right w:w="95" w:type="dxa"/>
+            </w:tcMar>
+          </w:tcPr>
+          <w:p>
+            <w:pPr>
+              <w:spacing w:after="100" w:before="100" w:line="247" w:lineRule="auto"/>
+            </w:pPr>
+            <w:r>
+              <w:rPr>
+                <w:sz w:val="20"/>
+              </w:rPr>
+            </w:r>
+            <w:r>
+              <w:rPr>
+                <w:rFonts w:ascii="Courier New" w:hAnsi="Courier New"/>
+                <w:sz w:val="20"/>
+              </w:rPr>
+              <w:t>cd frontend; npm run build</w:t>
+            </w:r>
+            <w:r>
+              <w:rPr>
+                <w:sz w:val="20"/>
+              </w:rPr>
+            </w:r>
+          </w:p>
+        </w:tc>
+        <w:tc>
+          <w:tcPr>
+            <w:tcW w:type="dxa" w:w="5616"/>
+            <w:vAlign w:val="center"/>
+            <w:shd w:fill="FFFFFF"/>
+            <w:tcBorders>
+              <w:top w:val="single" w:sz="4" w:color="D9D9D9"/>
+              <w:left w:val="single" w:sz="4" w:color="D9D9D9"/>
+              <w:bottom w:val="single" w:sz="4" w:color="D9D9D9"/>
+              <w:right w:val="single" w:sz="4" w:color="D9D9D9"/>
+            </w:tcBorders>
+            <w:tcMar>
+              <w:top w:w="95" w:type="dxa"/>
+              <w:left w:w="95" w:type="dxa"/>
+              <w:bottom w:w="95" w:type="dxa"/>
+              <w:right w:w="95" w:type="dxa"/>
+            </w:tcMar>
+          </w:tcPr>
+          <w:p>
+            <w:pPr>
+              <w:spacing w:after="100" w:before="100" w:line="247" w:lineRule="auto"/>
+            </w:pPr>
+            <w:r>
+              <w:rPr>
+                <w:sz w:val="20"/>
+              </w:rPr>
+              <w:t>Passed; the existing mixed static/dynamic import warning remains non-blocking</w:t>
+            </w:r>
+          </w:p>
+        </w:tc>
+      </w:tr>
+      <w:tr>
+        <w:trPr>
+          <w:cantSplit/>
+        </w:trPr>
+        <w:tc>
+          <w:tcPr>
+            <w:tcW w:type="dxa" w:w="4464"/>
+            <w:vAlign w:val="center"/>
+            <w:shd w:fill="FFFFFF"/>
+            <w:tcBorders>
+              <w:top w:val="single" w:sz="4" w:color="D9D9D9"/>
+              <w:left w:val="single" w:sz="4" w:color="D9D9D9"/>
+              <w:bottom w:val="single" w:sz="4" w:color="D9D9D9"/>
+              <w:right w:val="single" w:sz="4" w:color="D9D9D9"/>
+            </w:tcBorders>
+            <w:tcMar>
+              <w:top w:w="95" w:type="dxa"/>
+              <w:left w:w="95" w:type="dxa"/>
+              <w:bottom w:w="95" w:type="dxa"/>
+              <w:right w:w="95" w:type="dxa"/>
+            </w:tcMar>
+          </w:tcPr>
+          <w:p>
+            <w:pPr>
+              <w:spacing w:after="100" w:before="100" w:line="247" w:lineRule="auto"/>
+            </w:pPr>
+            <w:r>
+              <w:rPr>
+                <w:sz w:val="20"/>
+              </w:rPr>
+            </w:r>
+            <w:r>
+              <w:rPr>
+                <w:rFonts w:ascii="Courier New" w:hAnsi="Courier New"/>
+                <w:sz w:val="20"/>
+              </w:rPr>
+              <w:t>node tests/integration/restored-browser.cjs</w:t>
+            </w:r>
+            <w:r>
+              <w:rPr>
+                <w:sz w:val="20"/>
+              </w:rPr>
+            </w:r>
+          </w:p>
+        </w:tc>
+        <w:tc>
+          <w:tcPr>
+            <w:tcW w:type="dxa" w:w="5616"/>
+            <w:vAlign w:val="center"/>
+            <w:shd w:fill="FFFFFF"/>
+            <w:tcBorders>
+              <w:top w:val="single" w:sz="4" w:color="D9D9D9"/>
+              <w:left w:val="single" w:sz="4" w:color="D9D9D9"/>
+              <w:bottom w:val="single" w:sz="4" w:color="D9D9D9"/>
+              <w:right w:val="single" w:sz="4" w:color="D9D9D9"/>
+            </w:tcBorders>
+            <w:tcMar>
+              <w:top w:w="95" w:type="dxa"/>
+              <w:left w:w="95" w:type="dxa"/>
+              <w:bottom w:w="95" w:type="dxa"/>
+              <w:right w:w="95" w:type="dxa"/>
+            </w:tcMar>
+          </w:tcPr>
+          <w:p>
+            <w:pPr>
+              <w:spacing w:after="100" w:before="100" w:line="247" w:lineRule="auto"/>
+            </w:pPr>
+            <w:r>
+              <w:rPr>
+                <w:sz w:val="20"/>
+              </w:rPr>
+              <w:t>11 live workflow groups passed, with no page errors: both-role login, source create/test/manual scan/archive, ingestion details, missing-model AI task and real retry, administrator search, user search/filter/preview/similarity, completed archive retrieval and history, wrong-role route denial, search outage, mobile layout, and Audit CSV export</w:t>
+            </w:r>
+          </w:p>
+        </w:tc>
+      </w:tr>
+      <w:tr>
+        <w:trPr>
+          <w:cantSplit/>
+        </w:trPr>
+        <w:tc>
+          <w:tcPr>
+            <w:tcW w:type="dxa" w:w="4464"/>
+            <w:vAlign w:val="center"/>
+            <w:shd w:fill="FFFFFF"/>
+            <w:tcBorders>
+              <w:top w:val="single" w:sz="4" w:color="D9D9D9"/>
+              <w:left w:val="single" w:sz="4" w:color="D9D9D9"/>
+              <w:bottom w:val="single" w:sz="4" w:color="D9D9D9"/>
+              <w:right w:val="single" w:sz="4" w:color="D9D9D9"/>
+            </w:tcBorders>
+            <w:tcMar>
+              <w:top w:w="95" w:type="dxa"/>
+              <w:left w:w="95" w:type="dxa"/>
+              <w:bottom w:w="95" w:type="dxa"/>
+              <w:right w:w="95" w:type="dxa"/>
+            </w:tcMar>
+          </w:tcPr>
+          <w:p>
+            <w:pPr>
+              <w:spacing w:after="100" w:before="100" w:line="247" w:lineRule="auto"/>
+            </w:pPr>
+            <w:r>
+              <w:rPr>
+                <w:sz w:val="20"/>
+              </w:rPr>
+            </w:r>
+            <w:r>
+              <w:rPr>
+                <w:rFonts w:ascii="Courier New" w:hAnsi="Courier New"/>
+                <w:sz w:val="20"/>
+              </w:rPr>
+              <w:t>node tests/integration/restored-ui-regressions.cjs</w:t>
+            </w:r>
+            <w:r>
+              <w:rPr>
+                <w:sz w:val="20"/>
+              </w:rPr>
+            </w:r>
+          </w:p>
+        </w:tc>
+        <w:tc>
+          <w:tcPr>
+            <w:tcW w:type="dxa" w:w="5616"/>
+            <w:vAlign w:val="center"/>
+            <w:shd w:fill="FFFFFF"/>
+            <w:tcBorders>
+              <w:top w:val="single" w:sz="4" w:color="D9D9D9"/>
+              <w:left w:val="single" w:sz="4" w:color="D9D9D9"/>
+              <w:bottom w:val="single" w:sz="4" w:color="D9D9D9"/>
+              <w:right w:val="single" w:sz="4" w:color="D9D9D9"/>
+            </w:tcBorders>
+            <w:tcMar>
+              <w:top w:w="95" w:type="dxa"/>
+              <w:left w:w="95" w:type="dxa"/>
+              <w:bottom w:w="95" w:type="dxa"/>
+              <w:right w:w="95" w:type="dxa"/>
+            </w:tcMar>
+          </w:tcPr>
+          <w:p>
+            <w:pPr>
+              <w:spacing w:after="100" w:before="100" w:line="247" w:lineRule="auto"/>
+            </w:pPr>
+            <w:r>
+              <w:rPr>
+                <w:sz w:val="20"/>
+              </w:rPr>
+              <w:t>Nine browser-only fixture checks passed: hybrid default/server order, 61 results over three pages, filter reset, stale search/autocomplete rejection and keyboard selection, loading, corrupt-media unavailable preview, failed packaging without fake success, empty results, and permission denial</w:t>
+            </w:r>
+          </w:p>
+        </w:tc>
+      </w:tr>
+      <w:tr>
+        <w:trPr>
+          <w:cantSplit/>
+        </w:trPr>
+        <w:tc>
+          <w:tcPr>
+            <w:tcW w:type="dxa" w:w="4464"/>
+            <w:vAlign w:val="center"/>
+            <w:shd w:fill="FFFFFF"/>
+            <w:tcBorders>
+              <w:top w:val="single" w:sz="4" w:color="D9D9D9"/>
+              <w:left w:val="single" w:sz="4" w:color="D9D9D9"/>
+              <w:bottom w:val="single" w:sz="4" w:color="D9D9D9"/>
+              <w:right w:val="single" w:sz="4" w:color="D9D9D9"/>
+            </w:tcBorders>
+            <w:tcMar>
+              <w:top w:w="95" w:type="dxa"/>
+              <w:left w:w="95" w:type="dxa"/>
+              <w:bottom w:w="95" w:type="dxa"/>
+              <w:right w:w="95" w:type="dxa"/>
+            </w:tcMar>
+          </w:tcPr>
+          <w:p>
+            <w:pPr>
+              <w:spacing w:after="100" w:before="100" w:line="247" w:lineRule="auto"/>
+            </w:pPr>
+            <w:r>
+              <w:rPr>
+                <w:sz w:val="20"/>
+              </w:rPr>
+            </w:r>
+            <w:r>
+              <w:rPr>
+                <w:rFonts w:ascii="Courier New" w:hAnsi="Courier New"/>
+                <w:sz w:val="20"/>
+              </w:rPr>
+              <w:t>node tests/integration/redesign-comparison.cjs</w:t>
+            </w:r>
+            <w:r>
+              <w:rPr>
+                <w:sz w:val="20"/>
+              </w:rPr>
+            </w:r>
+          </w:p>
+        </w:tc>
+        <w:tc>
+          <w:tcPr>
+            <w:tcW w:type="dxa" w:w="5616"/>
+            <w:vAlign w:val="center"/>
+            <w:shd w:fill="FFFFFF"/>
+            <w:tcBorders>
+              <w:top w:val="single" w:sz="4" w:color="D9D9D9"/>
+              <w:left w:val="single" w:sz="4" w:color="D9D9D9"/>
+              <w:bottom w:val="single" w:sz="4" w:color="D9D9D9"/>
+              <w:right w:val="single" w:sz="4" w:color="D9D9D9"/>
+            </w:tcBorders>
+            <w:tcMar>
+              <w:top w:w="95" w:type="dxa"/>
+              <w:left w:w="95" w:type="dxa"/>
+              <w:bottom w:w="95" w:type="dxa"/>
+              <w:right w:w="95" w:type="dxa"/>
+            </w:tcMar>
+          </w:tcPr>
+          <w:p>
+            <w:pPr>
+              <w:spacing w:after="100" w:before="100" w:line="247" w:lineRule="auto"/>
+            </w:pPr>
+            <w:r>
+              <w:rPr>
+                <w:sz w:val="20"/>
+              </w:rPr>
+              <w:t>110 desktop 1440×1000 and mobile 390×844 screenshots for both previews, including public/authentication screens, module pages, forms, details, similarity, table/grid and selection states; no page errors or horizontal page overflow in the completed comparison run</w:t>
+            </w:r>
+          </w:p>
+        </w:tc>
+      </w:tr>
+      <w:tr>
+        <w:trPr>
+          <w:cantSplit/>
+        </w:trPr>
+        <w:tc>
+          <w:tcPr>
+            <w:tcW w:type="dxa" w:w="4464"/>
+            <w:vAlign w:val="center"/>
+            <w:shd w:fill="FFFFFF"/>
+            <w:tcBorders>
+              <w:top w:val="single" w:sz="4" w:color="D9D9D9"/>
+              <w:left w:val="single" w:sz="4" w:color="D9D9D9"/>
+              <w:bottom w:val="single" w:sz="4" w:color="D9D9D9"/>
+              <w:right w:val="single" w:sz="4" w:color="D9D9D9"/>
+            </w:tcBorders>
+            <w:tcMar>
+              <w:top w:w="95" w:type="dxa"/>
+              <w:left w:w="95" w:type="dxa"/>
+              <w:bottom w:w="95" w:type="dxa"/>
+              <w:right w:w="95" w:type="dxa"/>
+            </w:tcMar>
+          </w:tcPr>
+          <w:p>
+            <w:pPr>
+              <w:spacing w:after="100" w:before="100" w:line="247" w:lineRule="auto"/>
+            </w:pPr>
+            <w:r>
+              <w:rPr>
+                <w:sz w:val="20"/>
+              </w:rPr>
+            </w:r>
+            <w:r>
+              <w:rPr>
+                <w:rFonts w:ascii="Courier New" w:hAnsi="Courier New"/>
+                <w:sz w:val="20"/>
+              </w:rPr>
+              <w:t>git diff --check</w:t>
+            </w:r>
+            <w:r>
+              <w:rPr>
+                <w:sz w:val="20"/>
+              </w:rPr>
+            </w:r>
+          </w:p>
+        </w:tc>
+        <w:tc>
+          <w:tcPr>
+            <w:tcW w:type="dxa" w:w="5616"/>
+            <w:vAlign w:val="center"/>
+            <w:shd w:fill="FFFFFF"/>
+            <w:tcBorders>
+              <w:top w:val="single" w:sz="4" w:color="D9D9D9"/>
+              <w:left w:val="single" w:sz="4" w:color="D9D9D9"/>
+              <w:bottom w:val="single" w:sz="4" w:color="D9D9D9"/>
+              <w:right w:val="single" w:sz="4" w:color="D9D9D9"/>
+            </w:tcBorders>
+            <w:tcMar>
+              <w:top w:w="95" w:type="dxa"/>
+              <w:left w:w="95" w:type="dxa"/>
+              <w:bottom w:w="95" w:type="dxa"/>
+              <w:right w:w="95" w:type="dxa"/>
+            </w:tcMar>
+          </w:tcPr>
+          <w:p>
+            <w:pPr>
+              <w:spacing w:after="100" w:before="100" w:line="247" w:lineRule="auto"/>
+            </w:pPr>
+            <w:r>
+              <w:rPr>
+                <w:sz w:val="20"/>
+              </w:rPr>
+              <w:t>Passed</w:t>
+            </w:r>
+          </w:p>
+        </w:tc>
+      </w:tr>
+      <w:tr>
+        <w:trPr>
+          <w:cantSplit/>
+        </w:trPr>
+        <w:tc>
+          <w:tcPr>
+            <w:tcW w:type="dxa" w:w="4464"/>
+            <w:vAlign w:val="center"/>
+            <w:shd w:fill="FFFFFF"/>
+            <w:tcBorders>
+              <w:top w:val="single" w:sz="4" w:color="D9D9D9"/>
+              <w:left w:val="single" w:sz="4" w:color="D9D9D9"/>
+              <w:bottom w:val="single" w:sz="4" w:color="D9D9D9"/>
+              <w:right w:val="single" w:sz="4" w:color="D9D9D9"/>
+            </w:tcBorders>
+            <w:tcMar>
+              <w:top w:w="95" w:type="dxa"/>
+              <w:left w:w="95" w:type="dxa"/>
+              <w:bottom w:w="95" w:type="dxa"/>
+              <w:right w:w="95" w:type="dxa"/>
+            </w:tcMar>
+          </w:tcPr>
+          <w:p>
+            <w:pPr>
+              <w:spacing w:after="100" w:before="100" w:line="247" w:lineRule="auto"/>
+            </w:pPr>
+            <w:r>
+              <w:rPr>
+                <w:sz w:val="20"/>
+              </w:rPr>
+              <w:t>Frontend lint/type checker</w:t>
+            </w:r>
+          </w:p>
+        </w:tc>
+        <w:tc>
+          <w:tcPr>
+            <w:tcW w:type="dxa" w:w="5616"/>
+            <w:vAlign w:val="center"/>
+            <w:shd w:fill="FFFFFF"/>
+            <w:tcBorders>
+              <w:top w:val="single" w:sz="4" w:color="D9D9D9"/>
+              <w:left w:val="single" w:sz="4" w:color="D9D9D9"/>
+              <w:bottom w:val="single" w:sz="4" w:color="D9D9D9"/>
+              <w:right w:val="single" w:sz="4" w:color="D9D9D9"/>
+            </w:tcBorders>
+            <w:tcMar>
+              <w:top w:w="95" w:type="dxa"/>
+              <w:left w:w="95" w:type="dxa"/>
+              <w:bottom w:w="95" w:type="dxa"/>
+              <w:right w:w="95" w:type="dxa"/>
+            </w:tcMar>
+          </w:tcPr>
+          <w:p>
+            <w:pPr>
+              <w:spacing w:after="100" w:before="100" w:line="247" w:lineRule="auto"/>
+            </w:pPr>
+            <w:r>
+              <w:rPr>
+                <w:sz w:val="20"/>
+              </w:rPr>
+              <w:t>Neither suite is configured; no such pass is claimed</w:t>
+            </w:r>
+          </w:p>
+        </w:tc>
+      </w:tr>
+      <w:tr>
+        <w:trPr>
+          <w:cantSplit/>
+        </w:trPr>
+        <w:tc>
+          <w:tcPr>
+            <w:tcW w:type="dxa" w:w="4464"/>
+            <w:vAlign w:val="center"/>
+            <w:shd w:fill="FFFFFF"/>
+            <w:tcBorders>
+              <w:top w:val="single" w:sz="4" w:color="D9D9D9"/>
+              <w:left w:val="single" w:sz="4" w:color="D9D9D9"/>
+              <w:bottom w:val="single" w:sz="4" w:color="D9D9D9"/>
+              <w:right w:val="single" w:sz="4" w:color="D9D9D9"/>
+            </w:tcBorders>
+            <w:tcMar>
+              <w:top w:w="95" w:type="dxa"/>
+              <w:left w:w="95" w:type="dxa"/>
+              <w:bottom w:w="95" w:type="dxa"/>
+              <w:right w:w="95" w:type="dxa"/>
+            </w:tcMar>
+          </w:tcPr>
+          <w:p>
+            <w:pPr>
+              <w:spacing w:after="100" w:before="100" w:line="247" w:lineRule="auto"/>
+            </w:pPr>
+            <w:r>
+              <w:rPr>
+                <w:sz w:val="20"/>
+              </w:rPr>
+              <w:t>Backend suites</w:t>
+            </w:r>
+          </w:p>
+        </w:tc>
+        <w:tc>
+          <w:tcPr>
+            <w:tcW w:type="dxa" w:w="5616"/>
+            <w:vAlign w:val="center"/>
+            <w:shd w:fill="FFFFFF"/>
+            <w:tcBorders>
+              <w:top w:val="single" w:sz="4" w:color="D9D9D9"/>
+              <w:left w:val="single" w:sz="4" w:color="D9D9D9"/>
+              <w:bottom w:val="single" w:sz="4" w:color="D9D9D9"/>
+              <w:right w:val="single" w:sz="4" w:color="D9D9D9"/>
+            </w:tcBorders>
+            <w:tcMar>
+              <w:top w:w="95" w:type="dxa"/>
+              <w:left w:w="95" w:type="dxa"/>
+              <w:bottom w:w="95" w:type="dxa"/>
+              <w:right w:w="95" w:type="dxa"/>
+            </w:tcMar>
+          </w:tcPr>
+          <w:p>
+            <w:pPr>
+              <w:spacing w:after="100" w:before="100" w:line="247" w:lineRule="auto"/>
+            </w:pPr>
+            <w:r>
+              <w:rPr>
+                <w:sz w:val="20"/>
+              </w:rPr>
+              <w:t>Unchanged during this phase; earlier results above remain historical, rather than rerun results</w:t>
+            </w:r>
+          </w:p>
+        </w:tc>
+      </w:tr>
+    </w:tbl>
+    <w:p>
+      <w:pPr>
+        <w:spacing w:after="20"/>
+      </w:pPr>
+    </w:p>
+    <w:p>
+      <w:r>
+        <w:t xml:space="preserve">The original preview runs from an ignored isolated copy on </w:t>
+      </w:r>
+      <w:r>
+        <w:rPr>
+          <w:rFonts w:ascii="Courier New" w:hAnsi="Courier New"/>
+          <w:sz w:val="18"/>
+        </w:rPr>
+        <w:t>http://localhost:18001</w:t>
+      </w:r>
+      <w:r>
+        <w:t xml:space="preserve">; the restored real-service application is </w:t>
       </w:r>
       <w:r>
         <w:rPr>
@@ -2296,6 +3097,89 @@
         <w:t>http://localhost:18000</w:t>
       </w:r>
       <w:r>
+        <w:t xml:space="preserve">. The screenshot comparison gallery is </w:t>
+      </w:r>
+      <w:r>
+        <w:rPr>
+          <w:rFonts w:ascii="Courier New" w:hAnsi="Courier New"/>
+          <w:sz w:val="18"/>
+        </w:rPr>
+        <w:t>http://localhost:18002</w:t>
+      </w:r>
+      <w:r>
+        <w:t xml:space="preserve"> while its local helper is running. Comparison fixtures are intercepted only in test browser contexts and use the original sample records mapped into both response contracts. Unsupported original metrics and prototype media cannot have equivalent real API values, so their deliberate unavailable/real-preview differences are documented above. This is a reviewed visual restoration, not a claim of pixel identity or successful actual-model processing.</w:t>
+      </w:r>
+    </w:p>
+    <w:p>
+      <w:r>
+        <w:t xml:space="preserve">Reproducible browser scripts are tracked under </w:t>
+      </w:r>
+      <w:r>
+        <w:rPr>
+          <w:rFonts w:ascii="Courier New" w:hAnsi="Courier New"/>
+          <w:sz w:val="18"/>
+        </w:rPr>
+        <w:t>tests/integration/</w:t>
+      </w:r>
+      <w:r>
+        <w:t xml:space="preserve">. Captures and machine-readable results stay in ignored </w:t>
+      </w:r>
+      <w:r>
+        <w:rPr>
+          <w:rFonts w:ascii="Courier New" w:hAnsi="Courier New"/>
+          <w:sz w:val="18"/>
+        </w:rPr>
+        <w:t>.integration/redesign-qa/</w:t>
+      </w:r>
+      <w:r>
+        <w:t xml:space="preserve">; </w:t>
+      </w:r>
+      <w:r>
+        <w:rPr>
+          <w:rFonts w:ascii="Courier New" w:hAnsi="Courier New"/>
+          <w:sz w:val="18"/>
+        </w:rPr>
+        <w:t>build-comparison-gallery.cjs</w:t>
+      </w:r>
+      <w:r>
+        <w:t xml:space="preserve"> creates the local gallery. Real-service browser checks use synthetic accounts, empty bounded NAS test connectors, existing synthetic acceptance catalog records, and persistent test download/Audit records. These do not establish vendor source acceptance. Real NAS/S3 data and credentials were not replaced. The gateway serves the rebuilt host </w:t>
+      </w:r>
+      <w:r>
+        <w:rPr>
+          <w:rFonts w:ascii="Courier New" w:hAnsi="Courier New"/>
+          <w:sz w:val="18"/>
+        </w:rPr>
+        <w:t>frontend/dist</w:t>
+      </w:r>
+      <w:r>
+        <w:t xml:space="preserve"> through the existing local bind, so no backend restart or database reset was needed.</w:t>
+      </w:r>
+    </w:p>
+    <w:p>
+      <w:r>
+        <w:t>Remaining full-system blockers are unchanged: successful processing with all actual AI models, approved external S3/NAS workflows, real deployment migration rehearsal, optional native codec validation, and broader lint/edge-case coverage. Browser pagination now has deterministic UI coverage; exhaustive browser/device and all-administration-edge-case certification remains outside these results.</w:t>
+      </w:r>
+    </w:p>
+    <w:p>
+      <w:pPr>
+        <w:pStyle w:val="Heading2"/>
+      </w:pPr>
+      <w:r>
+        <w:t>Reproduction and remaining acceptance work</w:t>
+      </w:r>
+    </w:p>
+    <w:p>
+      <w:r>
+        <w:t xml:space="preserve">Use deploy/integration/README.md for environment mappings, build/start commands, schemas/migration order, source mounts, model checkpoints, ffmpeg/ffprobe, optional codecs, readiness, and recovery. The current local UI is at </w:t>
+      </w:r>
+      <w:r>
+        <w:rPr>
+          <w:rFonts w:ascii="Courier New" w:hAnsi="Courier New"/>
+          <w:sz w:val="18"/>
+        </w:rPr>
+        <w:t>http://localhost:18000</w:t>
+      </w:r>
+      <w:r>
         <w:t xml:space="preserve">; local bootstrap credentials are in the ignored </w:t>
       </w:r>
       <w:r>
@@ -2386,7 +3270,7 @@
         <w:ind w:left="288" w:hanging="288"/>
       </w:pPr>
       <w:r>
-        <w:t>5. Finish broad lint cleanup and extend browser coverage for large-result pagination and all administration edge cases. No enterprise IdP, scheduler, distributed scaling, or production deployment certification is included.</w:t>
+        <w:t>5. Finish broad lint cleanup and extend coverage for remaining administration edge cases. Large-result pagination now has a deterministic 61-record browser regression, distinct from a production corpus run. No enterprise IdP, scheduler, distributed scaling, or production deployment certification is included.</w:t>
       </w:r>
     </w:p>
     <w:p>
@@ -2494,7 +3378,7 @@
         <w:t>Frontend and integration owners:</w:t>
       </w:r>
       <w:r>
-        <w:t xml:space="preserve"> finish broader lint cleanup and browser checks for larger result sets, pagination, and remaining administration edge cases; verify actual-model results and failure states in both user roles.</w:t>
+        <w:t xml:space="preserve"> finish broader lint cleanup and remaining administration edge cases; larger-result pagination now has deterministic browser coverage; verify actual-model results and failure states in both user roles.</w:t>
       </w:r>
     </w:p>
     <w:p>
@@ -3636,6 +4520,219 @@
       </w:r>
       <w:r>
         <w:t xml:space="preserve"> for the exact verified results and remaining gaps.</w:t>
+      </w:r>
+    </w:p>
+    <w:p>
+      <w:pPr>
+        <w:pStyle w:val="Heading2"/>
+      </w:pPr>
+      <w:r>
+        <w:t>Restored frontend and visual review</w:t>
+      </w:r>
+    </w:p>
+    <w:p>
+      <w:r>
+        <w:t xml:space="preserve">The active UI uses the original </w:t>
+      </w:r>
+      <w:r>
+        <w:rPr>
+          <w:rFonts w:ascii="Courier New" w:hAnsi="Courier New"/>
+          <w:sz w:val="18"/>
+        </w:rPr>
+        <w:t>Feature/Re-designed-frontend</w:t>
+      </w:r>
+      <w:r>
+        <w:t xml:space="preserve"> design at </w:t>
+      </w:r>
+      <w:r>
+        <w:rPr>
+          <w:rFonts w:ascii="Courier New" w:hAnsi="Courier New"/>
+          <w:sz w:val="18"/>
+        </w:rPr>
+        <w:t>92ff6d1</w:t>
+      </w:r>
+      <w:r>
+        <w:t xml:space="preserve">, with service adapters on </w:t>
+      </w:r>
+      <w:r>
+        <w:rPr>
+          <w:rFonts w:ascii="Courier New" w:hAnsi="Courier New"/>
+          <w:sz w:val="18"/>
+        </w:rPr>
+        <w:t>Feature/Integration</w:t>
+      </w:r>
+      <w:r>
+        <w:t xml:space="preserve">. The local restoration is not pushed. Build it from </w:t>
+      </w:r>
+      <w:r>
+        <w:rPr>
+          <w:rFonts w:ascii="Courier New" w:hAnsi="Courier New"/>
+          <w:sz w:val="18"/>
+        </w:rPr>
+        <w:t>frontend</w:t>
+      </w:r>
+      <w:r>
+        <w:t xml:space="preserve"> with </w:t>
+      </w:r>
+      <w:r>
+        <w:rPr>
+          <w:rFonts w:ascii="Courier New" w:hAnsi="Courier New"/>
+          <w:sz w:val="18"/>
+        </w:rPr>
+        <w:t>npm run build</w:t>
+      </w:r>
+      <w:r>
+        <w:t xml:space="preserve">. In the current acceptance stack the gateway mounts the repository and serves </w:t>
+      </w:r>
+      <w:r>
+        <w:rPr>
+          <w:rFonts w:ascii="Courier New" w:hAnsi="Courier New"/>
+          <w:sz w:val="18"/>
+        </w:rPr>
+        <w:t>frontend/dist</w:t>
+      </w:r>
+      <w:r>
+        <w:t xml:space="preserve">, so refresh </w:t>
+      </w:r>
+      <w:r>
+        <w:rPr>
+          <w:rFonts w:ascii="Courier New" w:hAnsi="Courier New"/>
+          <w:sz w:val="18"/>
+        </w:rPr>
+        <w:t>http://localhost:18000</w:t>
+      </w:r>
+      <w:r>
+        <w:t xml:space="preserve"> after the build. For an image-only installation, rebuild/recreate the gateway using the Compose build instructions above; do not remove volumes. Existing login credentials and sessions remain valid.</w:t>
+      </w:r>
+    </w:p>
+    <w:p>
+      <w:r>
+        <w:t>Original layouts remain for every module and both search roles. Missing backend metrics show unavailable; scheduling, separate checksum revalidation, benchmark and unsupported filters remain disabled. Source scans are manual. Create a connector, test it from Sources, then trigger a manual crawl from its details. Archived connectors cannot start scans. Search defaults to hybrid and retains server ordering. Open a file for protected preview/similarity, select files for a persistent batch, and save the archive when ready or from Downloads. AI failures and missing models appear in the administrator inspector; retry queues real work and does not imply successful enrichment.</w:t>
+      </w:r>
+    </w:p>
+    <w:p>
+      <w:r>
+        <w:t xml:space="preserve">The isolated reference copy is </w:t>
+      </w:r>
+      <w:r>
+        <w:rPr>
+          <w:rFonts w:ascii="Courier New" w:hAnsi="Courier New"/>
+          <w:sz w:val="18"/>
+        </w:rPr>
+        <w:t>.integration/redesign-reference/frontend</w:t>
+      </w:r>
+      <w:r>
+        <w:t xml:space="preserve">, extracted from </w:t>
+      </w:r>
+      <w:r>
+        <w:rPr>
+          <w:rFonts w:ascii="Courier New" w:hAnsi="Courier New"/>
+          <w:sz w:val="18"/>
+        </w:rPr>
+        <w:t>92ff6d1</w:t>
+      </w:r>
+      <w:r>
+        <w:t xml:space="preserve"> without switching branches. It currently runs on </w:t>
+      </w:r>
+      <w:r>
+        <w:rPr>
+          <w:rFonts w:ascii="Courier New" w:hAnsi="Courier New"/>
+          <w:sz w:val="18"/>
+        </w:rPr>
+        <w:t>http://localhost:18001</w:t>
+      </w:r>
+      <w:r>
+        <w:t>, with only its local authentication proxy pointed at port 18000. Its prototype fixtures are for visual review only. The integrated application's runtime has no fixture substitution.</w:t>
+      </w:r>
+    </w:p>
+    <w:p>
+      <w:r>
+        <w:t>To reproduce comparison captures, prepare the ignored reference directory, install its frontend dependencies (or reuse the local frontend dependency directory), run its Vite preview on port 18001, and keep the integrated stack on port 18000. The scripts require Playwright and Edge available to Node. Run from the repository root:</w:t>
+      </w:r>
+    </w:p>
+    <w:p>
+      <w:pPr>
+        <w:keepLines/>
+        <w:spacing w:after="100"/>
+      </w:pPr>
+      <w:r>
+        <w:rPr>
+          <w:rFonts w:ascii="Courier New" w:hAnsi="Courier New"/>
+          <w:sz w:val="17"/>
+        </w:rPr>
+        <w:t>node tests/integration/restored-browser.cjs</w:t>
+      </w:r>
+    </w:p>
+    <w:p>
+      <w:pPr>
+        <w:keepLines/>
+        <w:spacing w:after="100"/>
+      </w:pPr>
+      <w:r>
+        <w:rPr>
+          <w:rFonts w:ascii="Courier New" w:hAnsi="Courier New"/>
+          <w:sz w:val="17"/>
+        </w:rPr>
+        <w:t>node tests/integration/restored-ui-regressions.cjs</w:t>
+      </w:r>
+    </w:p>
+    <w:p>
+      <w:pPr>
+        <w:keepLines/>
+        <w:spacing w:after="100"/>
+      </w:pPr>
+      <w:r>
+        <w:rPr>
+          <w:rFonts w:ascii="Courier New" w:hAnsi="Courier New"/>
+          <w:sz w:val="17"/>
+        </w:rPr>
+        <w:t>node tests/integration/redesign-comparison.cjs</w:t>
+      </w:r>
+    </w:p>
+    <w:p>
+      <w:pPr>
+        <w:keepLines/>
+        <w:spacing w:after="100"/>
+      </w:pPr>
+      <w:r>
+        <w:rPr>
+          <w:rFonts w:ascii="Courier New" w:hAnsi="Courier New"/>
+          <w:sz w:val="17"/>
+        </w:rPr>
+        <w:t>node tests/integration/build-comparison-gallery.cjs</w:t>
+      </w:r>
+    </w:p>
+    <w:p>
+      <w:r/>
+      <w:r>
+        <w:rPr>
+          <w:rFonts w:ascii="Courier New" w:hAnsi="Courier New"/>
+          <w:sz w:val="18"/>
+        </w:rPr>
+        <w:t>restored-browser.cjs</w:t>
+      </w:r>
+      <w:r>
+        <w:t xml:space="preserve"> uses the ignored bootstrap credentials, the existing synthetic acceptance catalog, and a one-file-limit empty NAS test directory to verify real operations. The other two browser suites inject test-only responses in their own browser contexts, including 61-result pagination and matched original sample records. They never configure fixtures in the running application. Screenshots and results are stored in </w:t>
+      </w:r>
+      <w:r>
+        <w:rPr>
+          <w:rFonts w:ascii="Courier New" w:hAnsi="Courier New"/>
+          <w:sz w:val="18"/>
+        </w:rPr>
+        <w:t>.integration/redesign-qa</w:t>
+      </w:r>
+      <w:r>
+        <w:t xml:space="preserve">; the gallery is </w:t>
+      </w:r>
+      <w:r>
+        <w:rPr>
+          <w:rFonts w:ascii="Courier New" w:hAnsi="Courier New"/>
+          <w:sz w:val="18"/>
+        </w:rPr>
+        <w:t>.integration/redesign-qa/comparison/index.html</w:t>
+      </w:r>
+      <w:r>
+        <w:t>. Its current optional localhost-only helper serves that directory on port 18002. Stop the reference and gallery helpers when review is complete; leave the integration stack and its volumes intact.</w:t>
       </w:r>
     </w:p>
     <w:sectPr>

</xml_diff>